<commit_message>
Update AT3 part 2 documentation
</commit_message>
<xml_diff>
--- a/documentation/AT3_Part_2_Scaffold-1.docx
+++ b/documentation/AT3_Part_2_Scaffold-1.docx
@@ -944,6 +944,17 @@
             <w:r>
               <w:t xml:space="preserve">  </w:t>
             </w:r>
+            <w:r>
+              <w:t xml:space="preserve">(you will need to enable simulate </w:t>
+            </w:r>
+            <w:proofErr w:type="spellStart"/>
+            <w:r>
+              <w:t>ios</w:t>
+            </w:r>
+            <w:proofErr w:type="spellEnd"/>
+            <w:r>
+              <w:t>)</w:t>
+            </w:r>
           </w:p>
           <w:p/>
           <w:p>
@@ -1048,640 +1059,13 @@
             </w:r>
           </w:p>
           <w:p>
-            <w:r>
-              <w:t>Plan</w:t>
-            </w:r>
-          </w:p>
-          <w:p>
-            <w:r>
-              <w:rPr>
-                <w:rFonts w:hint="eastAsia"/>
-              </w:rPr>
-              <w:t>①</w:t>
-            </w:r>
-            <w:r>
-              <w:t xml:space="preserve"> Demo the app — 7 min (your only overrun risk; rehearse against a clock)</w:t>
-            </w:r>
-          </w:p>
-          <w:p>
-            <w:r>
-              <w:t>- Demo account → dashboard (3 pie charts, paper-logbook table) → tap a trip → speed-coloured Leaflet map</w:t>
-            </w:r>
-          </w:p>
-          <w:p>
-            <w:r>
-              <w:t>- Start → live timer → End (auto weather, haversine end-</w:t>
-            </w:r>
-            <w:proofErr w:type="spellStart"/>
-            <w:r>
-              <w:t>odo</w:t>
-            </w:r>
-            <w:proofErr w:type="spellEnd"/>
-            <w:r>
-              <w:t>)</w:t>
-            </w:r>
-          </w:p>
-          <w:p>
-            <w:r>
-              <w:t xml:space="preserve">- Pair </w:t>
-            </w:r>
-            <w:proofErr w:type="gramStart"/>
-            <w:r>
-              <w:t>an</w:t>
-            </w:r>
-            <w:proofErr w:type="gramEnd"/>
-            <w:r>
-              <w:t xml:space="preserve"> L-plate + flip it — do this live, but have a 30-sec backup clip ready in case the hardware hangs</w:t>
-            </w:r>
-          </w:p>
-          <w:p/>
-          <w:p>
-            <w:r>
-              <w:rPr>
-                <w:rFonts w:hint="eastAsia"/>
-              </w:rPr>
-              <w:t>②</w:t>
-            </w:r>
-            <w:r>
-              <w:t xml:space="preserve"> "Now the backend" — 30 sec — one architecture sentence: 3 Flask services + nginx + Cloudflare, one login shared across subdomains. Then dive.</w:t>
-            </w:r>
-          </w:p>
-          <w:p/>
-          <w:p>
-            <w:r>
-              <w:rPr>
-                <w:rFonts w:hint="eastAsia"/>
-              </w:rPr>
-              <w:t>③</w:t>
-            </w:r>
-            <w:r>
-              <w:t xml:space="preserve"> Decorators: JWT &amp; error handling — 2 min</w:t>
-            </w:r>
-          </w:p>
-          <w:p>
-            <w:r>
-              <w:t xml:space="preserve">- </w:t>
-            </w:r>
-            <w:proofErr w:type="spellStart"/>
-            <w:r>
-              <w:t>require_auth</w:t>
-            </w:r>
-            <w:proofErr w:type="spellEnd"/>
-            <w:r>
-              <w:t xml:space="preserve"> (my_auth.py:20-43): decode token then re-check the user exists in the DB — signature alone isn't trusted</w:t>
-            </w:r>
-          </w:p>
-          <w:p>
-            <w:r>
-              <w:t>- Dual-source: cookie (web) + Bearer (native), one decorator</w:t>
-            </w:r>
-          </w:p>
-          <w:p>
-            <w:r>
-              <w:t xml:space="preserve">- </w:t>
-            </w:r>
-            <w:proofErr w:type="spellStart"/>
-            <w:r>
-              <w:t>handle_validation_error</w:t>
-            </w:r>
-            <w:proofErr w:type="spellEnd"/>
-            <w:r>
-              <w:t xml:space="preserve"> (app.py:45-60): rollback + log server-side + generic message to client</w:t>
-            </w:r>
-          </w:p>
-          <w:p/>
-          <w:p>
-            <w:r>
-              <w:rPr>
-                <w:rFonts w:hint="eastAsia"/>
-              </w:rPr>
-              <w:t>④</w:t>
-            </w:r>
-            <w:r>
-              <w:t xml:space="preserve"> Database design — 3 min</w:t>
-            </w:r>
-          </w:p>
-          <w:p>
-            <w:r>
-              <w:t xml:space="preserve">- Validation on the model via @validates (data.py:132-188) — cross-field </w:t>
-            </w:r>
-            <w:proofErr w:type="spellStart"/>
-            <w:r>
-              <w:t>end_odo</w:t>
-            </w:r>
-            <w:proofErr w:type="spellEnd"/>
-            <w:r>
-              <w:t xml:space="preserve"> &gt;= </w:t>
-            </w:r>
-            <w:proofErr w:type="spellStart"/>
-            <w:r>
-              <w:t>start_odo</w:t>
-            </w:r>
-            <w:proofErr w:type="spellEnd"/>
-            <w:r>
-              <w:t>, geo-bounds on GPS; no endpoint can forget to check</w:t>
-            </w:r>
-          </w:p>
-          <w:p>
-            <w:r>
-              <w:t>- Cascade delete + the ORM gotcha: delete trips per-object so the cascade fires (data.py:130, app.py:243)</w:t>
-            </w:r>
-          </w:p>
-          <w:p>
-            <w:r>
-              <w:t xml:space="preserve">- </w:t>
-            </w:r>
-            <w:proofErr w:type="spellStart"/>
-            <w:r>
-              <w:t>AiPreference</w:t>
-            </w:r>
-            <w:proofErr w:type="spellEnd"/>
-            <w:r>
-              <w:t xml:space="preserve"> (data.py:208-227): 5 sensitivity categories, all default-off — bridge to the AI section</w:t>
-            </w:r>
-          </w:p>
-          <w:p/>
-          <w:p>
-            <w:r>
-              <w:rPr>
-                <w:rFonts w:hint="eastAsia"/>
-              </w:rPr>
-              <w:t>⑤</w:t>
-            </w:r>
-            <w:r>
-              <w:t xml:space="preserve"> Trip class in TS — 3 min (say "this is client-side now")</w:t>
-            </w:r>
-          </w:p>
-          <w:p>
-            <w:r>
-              <w:t xml:space="preserve">- </w:t>
-            </w:r>
-            <w:proofErr w:type="spellStart"/>
-            <w:r>
-              <w:t>trips.ts</w:t>
-            </w:r>
-            <w:proofErr w:type="spellEnd"/>
-            <w:r>
-              <w:t xml:space="preserve"> types + the synced flag — the offline-first key</w:t>
-            </w:r>
-          </w:p>
-          <w:p>
-            <w:r>
-              <w:t>- Write locally first (</w:t>
-            </w:r>
-            <w:proofErr w:type="spellStart"/>
-            <w:r>
-              <w:t>startTrip.vue</w:t>
-            </w:r>
-            <w:proofErr w:type="spellEnd"/>
-            <w:r>
-              <w:t>), upload when online, one codebase iOS + web</w:t>
-            </w:r>
-          </w:p>
-          <w:p>
-            <w:r>
-              <w:t>- Frame it as offline capability, not just "a class"</w:t>
-            </w:r>
-          </w:p>
-          <w:p/>
-          <w:p>
-            <w:r>
-              <w:rPr>
-                <w:rFonts w:hint="eastAsia"/>
-              </w:rPr>
-              <w:t>⑥</w:t>
-            </w:r>
-            <w:r>
-              <w:t xml:space="preserve"> AI auth server: what it is — 2 min</w:t>
-            </w:r>
-          </w:p>
-          <w:p>
-            <w:r>
-              <w:t>- Separate service (:5050), holds no database, calls back into the backend on your token</w:t>
-            </w:r>
-          </w:p>
-          <w:p>
-            <w:r>
-              <w:t xml:space="preserve">- Self-hosted </w:t>
-            </w:r>
-            <w:proofErr w:type="spellStart"/>
-            <w:r>
-              <w:t>Ollama</w:t>
-            </w:r>
-            <w:proofErr w:type="spellEnd"/>
-            <w:r>
-              <w:t xml:space="preserve">, </w:t>
-            </w:r>
-            <w:proofErr w:type="spellStart"/>
-            <w:r>
-              <w:t>gpt-oss</w:t>
-            </w:r>
-            <w:proofErr w:type="spellEnd"/>
-            <w:r>
-              <w:t xml:space="preserve"> — no third-party API, data stays on your VPS</w:t>
-            </w:r>
-          </w:p>
-          <w:p>
-            <w:r>
-              <w:t>- X-Api-</w:t>
-            </w:r>
-            <w:proofErr w:type="spellStart"/>
-            <w:r>
-              <w:t>Url</w:t>
-            </w:r>
-            <w:proofErr w:type="spellEnd"/>
-            <w:r>
-              <w:t xml:space="preserve"> header pairs it to the right backend</w:t>
-            </w:r>
-          </w:p>
-          <w:p/>
-          <w:p>
-            <w:r>
-              <w:rPr>
-                <w:rFonts w:hint="eastAsia"/>
-              </w:rPr>
-              <w:t>⑦</w:t>
-            </w:r>
-            <w:r>
-              <w:t xml:space="preserve"> Tools: how they work — 3 min</w:t>
-            </w:r>
-          </w:p>
-          <w:p>
-            <w:r>
-              <w:t>- 10 tools, empty parameter schemas — model decides whether, never whose data</w:t>
-            </w:r>
-          </w:p>
-          <w:p>
-            <w:r>
-              <w:t>- Tools return computed summaries (</w:t>
-            </w:r>
-            <w:proofErr w:type="spellStart"/>
-            <w:r>
-              <w:t>format_for_ai</w:t>
-            </w:r>
-            <w:proofErr w:type="spellEnd"/>
-            <w:r>
-              <w:t>), raw rows never enter the prompt — the data-limiting story</w:t>
-            </w:r>
-          </w:p>
-          <w:p>
-            <w:r>
-              <w:t>- MAX_TOOL_ROUNDS = 4 cap + forced final answer</w:t>
-            </w:r>
-          </w:p>
-          <w:p/>
-          <w:p>
-            <w:r>
-              <w:rPr>
-                <w:rFonts w:hint="eastAsia"/>
-              </w:rPr>
-              <w:t>⑧</w:t>
-            </w:r>
-            <w:r>
-              <w:t xml:space="preserve"> How I made it secure — 3 min</w:t>
-            </w:r>
-          </w:p>
-          <w:p>
-            <w:r>
-              <w:t>- Consent enforced at the tool boundary, twice: only permitted schemas advertised (server.py:340), re-checked before execution (:260-264)</w:t>
-            </w:r>
-          </w:p>
-          <w:p>
-            <w:r>
-              <w:t xml:space="preserve">- Fail-closed (:182-191): </w:t>
-            </w:r>
-            <w:proofErr w:type="spellStart"/>
-            <w:r>
-              <w:t>prefs</w:t>
-            </w:r>
-            <w:proofErr w:type="spellEnd"/>
-            <w:r>
-              <w:t xml:space="preserve"> fetch fails → zero tools</w:t>
-            </w:r>
-          </w:p>
-          <w:p>
-            <w:r>
-              <w:t xml:space="preserve">- The cookie/subdomain story lives here: </w:t>
-            </w:r>
-            <w:proofErr w:type="spellStart"/>
-            <w:r>
-              <w:t>httpOnly</w:t>
-            </w:r>
-            <w:proofErr w:type="spellEnd"/>
-            <w:r>
-              <w:t xml:space="preserve"> cookie scoped </w:t>
-            </w:r>
-            <w:proofErr w:type="gramStart"/>
-            <w:r>
-              <w:t>to .</w:t>
-            </w:r>
-            <w:proofErr w:type="gramEnd"/>
-            <w:r>
-              <w:t>lflip.pebnum.com + credentialed CORS is why ai. can authenticate you</w:t>
-            </w:r>
-          </w:p>
-          <w:p/>
-          <w:p>
-            <w:r>
-              <w:rPr>
-                <w:rFonts w:hint="eastAsia"/>
-              </w:rPr>
-              <w:t>⑨</w:t>
-            </w:r>
-            <w:r>
-              <w:t xml:space="preserve"> ESP32 — 2 min</w:t>
-            </w:r>
-          </w:p>
-          <w:p>
-            <w:r>
-              <w:t xml:space="preserve">- Master (BLE server) ↔ edge plates (ESP-NOW); shared versioned </w:t>
-            </w:r>
-            <w:proofErr w:type="spellStart"/>
-            <w:r>
-              <w:t>protocol.h</w:t>
-            </w:r>
-            <w:proofErr w:type="spellEnd"/>
-          </w:p>
-          <w:p>
-            <w:r>
-              <w:t>- Physical-presence pairing: 60-sec button window, MAC saved to flash</w:t>
-            </w:r>
-          </w:p>
-          <w:p/>
-          <w:p>
-            <w:r>
-              <w:rPr>
-                <w:rFonts w:hint="eastAsia"/>
-              </w:rPr>
-              <w:t>⑩</w:t>
-            </w:r>
-            <w:r>
-              <w:t xml:space="preserve"> Pairing &amp; my security decisions — 2 min (not "auth")</w:t>
-            </w:r>
-          </w:p>
-          <w:p>
-            <w:r>
-              <w:t>- Trust-on-first-use, plaintext — a deliberate risk call</w:t>
-            </w:r>
-          </w:p>
-          <w:p>
-            <w:r>
-              <w:t>- Threat model: worst case = flip a plate on a visible car; no data, no safety, no money</w:t>
-            </w:r>
-          </w:p>
-          <w:p>
-            <w:r>
-              <w:t>- Production fix: ESP-NOW AES + BLE challenge-response — already in README backlog</w:t>
-            </w:r>
-          </w:p>
-          <w:p/>
-          <w:p/>
-          <w:p>
             <w:pPr>
-              <w:pStyle w:val="ListParagraph"/>
-              <w:numPr>
-                <w:ilvl w:val="0"/>
-                <w:numId w:val="7"/>
-              </w:numPr>
+              <w:rPr>
+                <w:i/>
+                <w:iCs/>
+              </w:rPr>
             </w:pPr>
-            <w:proofErr w:type="gramStart"/>
-            <w:r>
-              <w:t>First</w:t>
-            </w:r>
-            <w:proofErr w:type="gramEnd"/>
-            <w:r>
-              <w:t xml:space="preserve"> I will demo the app and </w:t>
-            </w:r>
-            <w:proofErr w:type="gramStart"/>
-            <w:r>
-              <w:t>all of</w:t>
-            </w:r>
-            <w:proofErr w:type="gramEnd"/>
-            <w:r>
-              <w:t xml:space="preserve"> its features including pairing an L plate and viewing a trip on my phone</w:t>
-            </w:r>
-          </w:p>
-          <w:p>
-            <w:pPr>
-              <w:pStyle w:val="ListParagraph"/>
-              <w:numPr>
-                <w:ilvl w:val="0"/>
-                <w:numId w:val="7"/>
-              </w:numPr>
-            </w:pPr>
-            <w:proofErr w:type="gramStart"/>
-            <w:r>
-              <w:t>Next</w:t>
-            </w:r>
-            <w:proofErr w:type="gramEnd"/>
-            <w:r>
-              <w:t xml:space="preserve"> I will go over the </w:t>
-            </w:r>
-            <w:r>
-              <w:t xml:space="preserve">then </w:t>
-            </w:r>
-            <w:proofErr w:type="spellStart"/>
-            <w:r>
-              <w:t>bacend</w:t>
-            </w:r>
-            <w:proofErr w:type="spellEnd"/>
-          </w:p>
-          <w:p>
-            <w:pPr>
-              <w:pStyle w:val="ListParagraph"/>
-              <w:numPr>
-                <w:ilvl w:val="0"/>
-                <w:numId w:val="7"/>
-              </w:numPr>
-            </w:pPr>
-            <w:r>
-              <w:rPr>
-                <w:sz w:val="28"/>
-                <w:szCs w:val="28"/>
-              </w:rPr>
-              <w:t xml:space="preserve">    </w:t>
-            </w:r>
-            <w:r>
-              <w:rPr>
-                <w:sz w:val="28"/>
-                <w:szCs w:val="28"/>
-              </w:rPr>
-              <w:t xml:space="preserve">I will go over my decorators for </w:t>
-            </w:r>
-            <w:proofErr w:type="spellStart"/>
-            <w:r>
-              <w:rPr>
-                <w:sz w:val="28"/>
-                <w:szCs w:val="28"/>
-              </w:rPr>
-              <w:t>jwt</w:t>
-            </w:r>
-            <w:proofErr w:type="spellEnd"/>
-            <w:r>
-              <w:rPr>
-                <w:sz w:val="28"/>
-                <w:szCs w:val="28"/>
-              </w:rPr>
-              <w:t xml:space="preserve"> </w:t>
-            </w:r>
-            <w:r>
-              <w:rPr>
-                <w:sz w:val="28"/>
-                <w:szCs w:val="28"/>
-              </w:rPr>
-              <w:t>and error handling</w:t>
-            </w:r>
-          </w:p>
-          <w:p>
-            <w:pPr>
-              <w:pStyle w:val="ListParagraph"/>
-              <w:numPr>
-                <w:ilvl w:val="0"/>
-                <w:numId w:val="7"/>
-              </w:numPr>
-            </w:pPr>
-            <w:r>
-              <w:rPr>
-                <w:sz w:val="28"/>
-                <w:szCs w:val="28"/>
-              </w:rPr>
-              <w:t xml:space="preserve">    I will go over the data base design </w:t>
-            </w:r>
-          </w:p>
-          <w:p>
-            <w:pPr>
-              <w:pStyle w:val="ListParagraph"/>
-              <w:numPr>
-                <w:ilvl w:val="0"/>
-                <w:numId w:val="7"/>
-              </w:numPr>
-            </w:pPr>
-            <w:r>
-              <w:rPr>
-                <w:sz w:val="28"/>
-                <w:szCs w:val="28"/>
-              </w:rPr>
-              <w:t xml:space="preserve">    I will move to the trip class in </w:t>
-            </w:r>
-            <w:proofErr w:type="spellStart"/>
-            <w:r>
-              <w:rPr>
-                <w:sz w:val="28"/>
-                <w:szCs w:val="28"/>
-              </w:rPr>
-              <w:t>ts</w:t>
-            </w:r>
-            <w:proofErr w:type="spellEnd"/>
-          </w:p>
-          <w:p>
-            <w:pPr>
-              <w:pStyle w:val="ListParagraph"/>
-              <w:numPr>
-                <w:ilvl w:val="0"/>
-                <w:numId w:val="7"/>
-              </w:numPr>
-            </w:pPr>
-            <w:r>
-              <w:rPr>
-                <w:sz w:val="28"/>
-                <w:szCs w:val="28"/>
-              </w:rPr>
-              <w:t>Ai auth server</w:t>
-            </w:r>
-            <w:r>
-              <w:rPr>
-                <w:sz w:val="28"/>
-                <w:szCs w:val="28"/>
-              </w:rPr>
-              <w:t xml:space="preserve"> </w:t>
-            </w:r>
-          </w:p>
-          <w:p>
-            <w:pPr>
-              <w:pStyle w:val="ListParagraph"/>
-              <w:numPr>
-                <w:ilvl w:val="0"/>
-                <w:numId w:val="7"/>
-              </w:numPr>
-            </w:pPr>
-            <w:r>
-              <w:rPr>
-                <w:sz w:val="28"/>
-                <w:szCs w:val="28"/>
-              </w:rPr>
-              <w:t xml:space="preserve">     Tools how </w:t>
-            </w:r>
-            <w:proofErr w:type="spellStart"/>
-            <w:r>
-              <w:rPr>
-                <w:sz w:val="28"/>
-                <w:szCs w:val="28"/>
-              </w:rPr>
-              <w:t>thay</w:t>
-            </w:r>
-            <w:proofErr w:type="spellEnd"/>
-            <w:r>
-              <w:rPr>
-                <w:sz w:val="28"/>
-                <w:szCs w:val="28"/>
-              </w:rPr>
-              <w:t xml:space="preserve"> work </w:t>
-            </w:r>
-          </w:p>
-          <w:p>
-            <w:pPr>
-              <w:pStyle w:val="ListParagraph"/>
-              <w:numPr>
-                <w:ilvl w:val="0"/>
-                <w:numId w:val="7"/>
-              </w:numPr>
-            </w:pPr>
-            <w:r>
-              <w:rPr>
-                <w:sz w:val="28"/>
-                <w:szCs w:val="28"/>
-              </w:rPr>
-              <w:t xml:space="preserve">      How I made it secure </w:t>
-            </w:r>
-          </w:p>
-          <w:p>
-            <w:pPr>
-              <w:pStyle w:val="ListParagraph"/>
-              <w:numPr>
-                <w:ilvl w:val="0"/>
-                <w:numId w:val="7"/>
-              </w:numPr>
-            </w:pPr>
-            <w:r>
-              <w:rPr>
-                <w:sz w:val="28"/>
-                <w:szCs w:val="28"/>
-              </w:rPr>
-              <w:t xml:space="preserve">Esp 32 </w:t>
-            </w:r>
-          </w:p>
-          <w:p>
-            <w:pPr>
-              <w:pStyle w:val="ListParagraph"/>
-              <w:numPr>
-                <w:ilvl w:val="0"/>
-                <w:numId w:val="7"/>
-              </w:numPr>
-            </w:pPr>
-            <w:r>
-              <w:rPr>
-                <w:sz w:val="28"/>
-                <w:szCs w:val="28"/>
-              </w:rPr>
-              <w:t xml:space="preserve">     How I did pairing and auth</w:t>
-            </w:r>
-          </w:p>
-          <w:p>
-            <w:pPr>
-              <w:pStyle w:val="ListParagraph"/>
-            </w:pPr>
-          </w:p>
-          <w:p/>
+          </w:p>
         </w:tc>
       </w:tr>
     </w:tbl>
@@ -1692,7 +1076,6 @@
       </w:pPr>
       <w:bookmarkStart w:id="5" w:name="_Toc1286182448"/>
       <w:r>
-        <w:lastRenderedPageBreak/>
         <w:t>Section 4 - Testing and Maintaining</w:t>
       </w:r>
       <w:r>
@@ -2203,11 +1586,7 @@
                 </w:p>
                 <w:p>
                   <w:r>
-                    <w:t xml:space="preserve">Repeat for the other make </w:t>
-                  </w:r>
-                  <w:r>
-                    <w:lastRenderedPageBreak/>
-                    <w:t xml:space="preserve">sure that you are stopped </w:t>
+                    <w:t xml:space="preserve">Repeat for the other make sure that you are stopped </w:t>
                   </w:r>
                 </w:p>
               </w:tc>
@@ -2217,7 +1596,6 @@
                 </w:tcPr>
                 <w:p>
                   <w:r>
-                    <w:lastRenderedPageBreak/>
                     <w:t>Rejected</w:t>
                   </w:r>
                   <w:r>
@@ -2242,11 +1620,7 @@
                   </w:r>
                   <w:proofErr w:type="gramEnd"/>
                   <w:r>
-                    <w:t xml:space="preserve"> infrastructur</w:t>
-                  </w:r>
-                  <w:r>
-                    <w:lastRenderedPageBreak/>
-                    <w:t>e but were clear enough to help the user troubleshoot their issue</w:t>
+                    <w:t xml:space="preserve"> infrastructure but were clear enough to help the user troubleshoot their issue</w:t>
                   </w:r>
                 </w:p>
               </w:tc>
@@ -2256,7 +1630,6 @@
                 </w:tcPr>
                 <w:p>
                   <w:r>
-                    <w:lastRenderedPageBreak/>
                     <w:t>pass</w:t>
                   </w:r>
                 </w:p>
@@ -2389,7 +1762,11 @@
                     <w:t xml:space="preserve">. </w:t>
                   </w:r>
                   <w:r>
-                    <w:t>This is not functionality I would like to support because it just introduces the possibility for bugs with minimal gain so I'm OK with this failure</w:t>
+                    <w:t xml:space="preserve">This is not functionality I would like to support because it just introduces the possibility for bugs with minimal </w:t>
+                  </w:r>
+                  <w:r>
+                    <w:lastRenderedPageBreak/>
+                    <w:t>gain so I'm OK with this failure</w:t>
                   </w:r>
                 </w:p>
               </w:tc>
@@ -2401,6 +1778,7 @@
                 </w:tcPr>
                 <w:p>
                   <w:r>
+                    <w:lastRenderedPageBreak/>
                     <w:t>5</w:t>
                   </w:r>
                 </w:p>
@@ -2795,7 +2173,6 @@
                 </w:p>
                 <w:p>
                   <w:r>
-                    <w:lastRenderedPageBreak/>
                     <w:t>turn on dark mode in iOS settings</w:t>
                   </w:r>
                 </w:p>
@@ -2811,12 +2188,7 @@
                 </w:tcPr>
                 <w:p>
                   <w:r>
-                    <w:lastRenderedPageBreak/>
-                    <w:t xml:space="preserve">I would expect that </w:t>
-                  </w:r>
-                  <w:r>
-                    <w:lastRenderedPageBreak/>
-                    <w:t>all the text is readable and the themes match up with no excessive amounts of light colours</w:t>
+                    <w:t>I would expect that all the text is readable and the themes match up with no excessive amounts of light colours</w:t>
                   </w:r>
                 </w:p>
               </w:tc>
@@ -2826,12 +2198,7 @@
                 </w:tcPr>
                 <w:p>
                   <w:r>
-                    <w:lastRenderedPageBreak/>
-                    <w:t xml:space="preserve">I found a few text boxes </w:t>
-                  </w:r>
-                  <w:r>
-                    <w:lastRenderedPageBreak/>
-                    <w:t>and themes that were not properly in dark mode</w:t>
+                    <w:t>I found a few text boxes and themes that were not properly in dark mode</w:t>
                   </w:r>
                 </w:p>
               </w:tc>
@@ -2841,7 +2208,6 @@
                 </w:tcPr>
                 <w:p>
                   <w:r>
-                    <w:lastRenderedPageBreak/>
                     <w:t>Fail</w:t>
                   </w:r>
                 </w:p>
@@ -2852,11 +2218,7 @@
                 </w:tcPr>
                 <w:p>
                   <w:r>
-                    <w:t xml:space="preserve">update my CSS and theming as </w:t>
-                  </w:r>
-                  <w:r>
-                    <w:lastRenderedPageBreak/>
-                    <w:t>well as my colour palette to work with dark mode</w:t>
+                    <w:t>update my CSS and theming as well as my colour palette to work with dark mode</w:t>
                   </w:r>
                 </w:p>
               </w:tc>
@@ -2868,37 +2230,37 @@
                 </w:tcPr>
                 <w:p>
                   <w:r>
+                    <w:t>9</w:t>
+                  </w:r>
+                </w:p>
+              </w:tc>
+              <w:tc>
+                <w:tcPr>
+                  <w:tcW w:w="1701" w:type="dxa"/>
+                </w:tcPr>
+                <w:p>
+                  <w:r>
+                    <w:t>Verify AI data filtering works</w:t>
+                  </w:r>
+                </w:p>
+              </w:tc>
+              <w:tc>
+                <w:tcPr>
+                  <w:tcW w:w="1843" w:type="dxa"/>
+                </w:tcPr>
+                <w:p>
+                  <w:r>
+                    <w:t>Create a demo account give it full permission to access all data</w:t>
+                  </w:r>
+                </w:p>
+                <w:p>
+                  <w:r>
+                    <w:t>Ask the model about driving variance and try and get it to use all the personal data</w:t>
+                  </w:r>
+                </w:p>
+                <w:p>
+                  <w:r>
                     <w:lastRenderedPageBreak/>
-                    <w:t>9</w:t>
-                  </w:r>
-                </w:p>
-              </w:tc>
-              <w:tc>
-                <w:tcPr>
-                  <w:tcW w:w="1701" w:type="dxa"/>
-                </w:tcPr>
-                <w:p>
-                  <w:r>
-                    <w:t>Verify AI data filtering works</w:t>
-                  </w:r>
-                </w:p>
-              </w:tc>
-              <w:tc>
-                <w:tcPr>
-                  <w:tcW w:w="1843" w:type="dxa"/>
-                </w:tcPr>
-                <w:p>
-                  <w:r>
-                    <w:t>Create a demo account give it full permission to access all data</w:t>
-                  </w:r>
-                </w:p>
-                <w:p>
-                  <w:r>
-                    <w:t>Ask the model about driving variance and try and get it to use all the personal data</w:t>
-                  </w:r>
-                </w:p>
-                <w:p>
-                  <w:r>
                     <w:t>Repeat this setup, but don’t give it any access to information but check that it can’t access the information</w:t>
                   </w:r>
                 </w:p>
@@ -2909,7 +2271,12 @@
                 </w:tcPr>
                 <w:p>
                   <w:r>
-                    <w:t>The expected result is in the first case to get trip information and other specific information about you</w:t>
+                    <w:lastRenderedPageBreak/>
+                    <w:t>The expected result is in the first case to get trip information and other specific informatio</w:t>
+                  </w:r>
+                  <w:r>
+                    <w:lastRenderedPageBreak/>
+                    <w:t>n about you</w:t>
                   </w:r>
                 </w:p>
                 <w:p>
@@ -2924,6 +2291,7 @@
                 </w:tcPr>
                 <w:p>
                   <w:r>
+                    <w:lastRenderedPageBreak/>
                     <w:t xml:space="preserve">My server hardening worked </w:t>
                   </w:r>
                   <w:r>
@@ -2946,7 +2314,11 @@
                   <w:proofErr w:type="spellEnd"/>
                   <w:proofErr w:type="gramEnd"/>
                   <w:r>
-                    <w:t xml:space="preserve"> inherent limitation of using an LLM</w:t>
+                    <w:t xml:space="preserve"> inherent </w:t>
+                  </w:r>
+                  <w:r>
+                    <w:lastRenderedPageBreak/>
+                    <w:t>limitation of using an LLM</w:t>
                   </w:r>
                 </w:p>
               </w:tc>
@@ -2956,6 +2328,7 @@
                 </w:tcPr>
                 <w:p>
                   <w:r>
+                    <w:lastRenderedPageBreak/>
                     <w:t>pass</w:t>
                   </w:r>
                 </w:p>
@@ -3098,11 +2471,7 @@
                   </w:r>
                   <w:proofErr w:type="gramEnd"/>
                   <w:r>
-                    <w:t xml:space="preserve"> with the AI until you hit a token </w:t>
-                  </w:r>
-                  <w:r>
-                    <w:lastRenderedPageBreak/>
-                    <w:t>limit or decide that the token limit is not there</w:t>
+                    <w:t xml:space="preserve"> with the AI until you hit a token limit or decide that the token limit is not there</w:t>
                   </w:r>
                 </w:p>
               </w:tc>
@@ -3112,7 +2481,6 @@
                 </w:tcPr>
                 <w:p>
                   <w:r>
-                    <w:lastRenderedPageBreak/>
                     <w:t>Get a pop-up or other notification from the LM that you’re out of tokens</w:t>
                   </w:r>
                 </w:p>
@@ -3136,11 +2504,7 @@
                 </w:p>
                 <w:p>
                   <w:r>
-                    <w:t xml:space="preserve">All you got was a pop-up saying </w:t>
-                  </w:r>
-                  <w:r>
-                    <w:lastRenderedPageBreak/>
-                    <w:t>please check your connection which is not informative and it is counter-</w:t>
+                    <w:t>All you got was a pop-up saying please check your connection which is not informative and it is counter-</w:t>
                   </w:r>
                   <w:proofErr w:type="gramStart"/>
                   <w:r>
@@ -3158,7 +2522,6 @@
                 </w:tcPr>
                 <w:p>
                   <w:r>
-                    <w:lastRenderedPageBreak/>
                     <w:t>pass</w:t>
                   </w:r>
                 </w:p>
@@ -3189,11 +2552,7 @@
                   </w:r>
                   <w:proofErr w:type="gramEnd"/>
                   <w:r>
-                    <w:t xml:space="preserve"> already </w:t>
-                  </w:r>
-                  <w:r>
-                    <w:lastRenderedPageBreak/>
-                    <w:t>gotten some trips.</w:t>
+                    <w:t xml:space="preserve"> already gotten some trips.</w:t>
                   </w:r>
                   <w:r>
                     <w:t xml:space="preserve">” This is something I need to fix by removing the HTML escaping on the backend because </w:t>
@@ -3222,37 +2581,37 @@
                 </w:tcPr>
                 <w:p>
                   <w:r>
+                    <w:t>12</w:t>
+                  </w:r>
+                </w:p>
+              </w:tc>
+              <w:tc>
+                <w:tcPr>
+                  <w:tcW w:w="1701" w:type="dxa"/>
+                </w:tcPr>
+                <w:p>
+                  <w:r>
+                    <w:t>Verify hardware pairing works</w:t>
+                  </w:r>
+                </w:p>
+              </w:tc>
+              <w:tc>
+                <w:tcPr>
+                  <w:tcW w:w="1843" w:type="dxa"/>
+                </w:tcPr>
+                <w:p>
+                  <w:r>
+                    <w:t>Put both master and slave into pairing mode</w:t>
+                  </w:r>
+                </w:p>
+                <w:p>
+                  <w:r>
+                    <w:t>Verify they make a connection</w:t>
+                  </w:r>
+                </w:p>
+                <w:p>
+                  <w:r>
                     <w:lastRenderedPageBreak/>
-                    <w:t>12</w:t>
-                  </w:r>
-                </w:p>
-              </w:tc>
-              <w:tc>
-                <w:tcPr>
-                  <w:tcW w:w="1701" w:type="dxa"/>
-                </w:tcPr>
-                <w:p>
-                  <w:r>
-                    <w:t>Verify hardware pairing works</w:t>
-                  </w:r>
-                </w:p>
-              </w:tc>
-              <w:tc>
-                <w:tcPr>
-                  <w:tcW w:w="1843" w:type="dxa"/>
-                </w:tcPr>
-                <w:p>
-                  <w:r>
-                    <w:t>Put both master and slave into pairing mode</w:t>
-                  </w:r>
-                </w:p>
-                <w:p>
-                  <w:r>
-                    <w:t>Verify they make a connection</w:t>
-                  </w:r>
-                </w:p>
-                <w:p>
-                  <w:r>
                     <w:t>Go and pair the master to your phone test that L plates toggle</w:t>
                   </w:r>
                 </w:p>
@@ -3263,7 +2622,12 @@
                 </w:tcPr>
                 <w:p>
                   <w:r>
-                    <w:t>The master and slave will connect. Then they will seamlessly toggle with an intuitive UI</w:t>
+                    <w:lastRenderedPageBreak/>
+                    <w:t xml:space="preserve">The master and slave will connect. Then they will seamlessly </w:t>
+                  </w:r>
+                  <w:r>
+                    <w:lastRenderedPageBreak/>
+                    <w:t>toggle with an intuitive UI</w:t>
                   </w:r>
                 </w:p>
               </w:tc>
@@ -3273,6 +2637,7 @@
                 </w:tcPr>
                 <w:p>
                   <w:r>
+                    <w:lastRenderedPageBreak/>
                     <w:t>This works as expected</w:t>
                   </w:r>
                 </w:p>
@@ -3484,198 +2849,6 @@
                 </w:p>
               </w:tc>
             </w:tr>
-            <w:tr>
-              <w:tc>
-                <w:tcPr>
-                  <w:tcW w:w="733" w:type="dxa"/>
-                </w:tcPr>
-                <w:p>
-                  <w:r>
-                    <w:t>14</w:t>
-                  </w:r>
-                </w:p>
-              </w:tc>
-              <w:tc>
-                <w:tcPr>
-                  <w:tcW w:w="1701" w:type="dxa"/>
-                </w:tcPr>
-                <w:p/>
-              </w:tc>
-              <w:tc>
-                <w:tcPr>
-                  <w:tcW w:w="1843" w:type="dxa"/>
-                </w:tcPr>
-                <w:p/>
-              </w:tc>
-              <w:tc>
-                <w:tcPr>
-                  <w:tcW w:w="1417" w:type="dxa"/>
-                </w:tcPr>
-                <w:p/>
-              </w:tc>
-              <w:tc>
-                <w:tcPr>
-                  <w:tcW w:w="1611" w:type="dxa"/>
-                </w:tcPr>
-                <w:p/>
-              </w:tc>
-              <w:tc>
-                <w:tcPr>
-                  <w:tcW w:w="802" w:type="dxa"/>
-                </w:tcPr>
-                <w:p/>
-              </w:tc>
-              <w:tc>
-                <w:tcPr>
-                  <w:tcW w:w="2122" w:type="dxa"/>
-                </w:tcPr>
-                <w:p/>
-              </w:tc>
-            </w:tr>
-            <w:tr>
-              <w:tc>
-                <w:tcPr>
-                  <w:tcW w:w="733" w:type="dxa"/>
-                </w:tcPr>
-                <w:p>
-                  <w:r>
-                    <w:t>15</w:t>
-                  </w:r>
-                </w:p>
-              </w:tc>
-              <w:tc>
-                <w:tcPr>
-                  <w:tcW w:w="1701" w:type="dxa"/>
-                </w:tcPr>
-                <w:p/>
-              </w:tc>
-              <w:tc>
-                <w:tcPr>
-                  <w:tcW w:w="1843" w:type="dxa"/>
-                </w:tcPr>
-                <w:p/>
-              </w:tc>
-              <w:tc>
-                <w:tcPr>
-                  <w:tcW w:w="1417" w:type="dxa"/>
-                </w:tcPr>
-                <w:p/>
-              </w:tc>
-              <w:tc>
-                <w:tcPr>
-                  <w:tcW w:w="1611" w:type="dxa"/>
-                </w:tcPr>
-                <w:p/>
-              </w:tc>
-              <w:tc>
-                <w:tcPr>
-                  <w:tcW w:w="802" w:type="dxa"/>
-                </w:tcPr>
-                <w:p/>
-              </w:tc>
-              <w:tc>
-                <w:tcPr>
-                  <w:tcW w:w="2122" w:type="dxa"/>
-                </w:tcPr>
-                <w:p/>
-              </w:tc>
-            </w:tr>
-            <w:tr>
-              <w:tc>
-                <w:tcPr>
-                  <w:tcW w:w="733" w:type="dxa"/>
-                </w:tcPr>
-                <w:p>
-                  <w:r>
-                    <w:t>16</w:t>
-                  </w:r>
-                </w:p>
-              </w:tc>
-              <w:tc>
-                <w:tcPr>
-                  <w:tcW w:w="1701" w:type="dxa"/>
-                </w:tcPr>
-                <w:p/>
-              </w:tc>
-              <w:tc>
-                <w:tcPr>
-                  <w:tcW w:w="1843" w:type="dxa"/>
-                </w:tcPr>
-                <w:p/>
-              </w:tc>
-              <w:tc>
-                <w:tcPr>
-                  <w:tcW w:w="1417" w:type="dxa"/>
-                </w:tcPr>
-                <w:p/>
-              </w:tc>
-              <w:tc>
-                <w:tcPr>
-                  <w:tcW w:w="1611" w:type="dxa"/>
-                </w:tcPr>
-                <w:p/>
-              </w:tc>
-              <w:tc>
-                <w:tcPr>
-                  <w:tcW w:w="802" w:type="dxa"/>
-                </w:tcPr>
-                <w:p/>
-              </w:tc>
-              <w:tc>
-                <w:tcPr>
-                  <w:tcW w:w="2122" w:type="dxa"/>
-                </w:tcPr>
-                <w:p/>
-              </w:tc>
-            </w:tr>
-            <w:tr>
-              <w:tc>
-                <w:tcPr>
-                  <w:tcW w:w="733" w:type="dxa"/>
-                </w:tcPr>
-                <w:p>
-                  <w:r>
-                    <w:t>17</w:t>
-                  </w:r>
-                </w:p>
-              </w:tc>
-              <w:tc>
-                <w:tcPr>
-                  <w:tcW w:w="1701" w:type="dxa"/>
-                </w:tcPr>
-                <w:p/>
-              </w:tc>
-              <w:tc>
-                <w:tcPr>
-                  <w:tcW w:w="1843" w:type="dxa"/>
-                </w:tcPr>
-                <w:p/>
-              </w:tc>
-              <w:tc>
-                <w:tcPr>
-                  <w:tcW w:w="1417" w:type="dxa"/>
-                </w:tcPr>
-                <w:p/>
-              </w:tc>
-              <w:tc>
-                <w:tcPr>
-                  <w:tcW w:w="1611" w:type="dxa"/>
-                </w:tcPr>
-                <w:p/>
-              </w:tc>
-              <w:tc>
-                <w:tcPr>
-                  <w:tcW w:w="802" w:type="dxa"/>
-                </w:tcPr>
-                <w:p/>
-              </w:tc>
-              <w:tc>
-                <w:tcPr>
-                  <w:tcW w:w="2122" w:type="dxa"/>
-                </w:tcPr>
-                <w:p/>
-              </w:tc>
-            </w:tr>
           </w:tbl>
           <w:p/>
           <w:p>
@@ -3840,7 +3013,6 @@
           </w:p>
           <w:p>
             <w:r>
-              <w:lastRenderedPageBreak/>
               <w:t>"highway": 20,</w:t>
             </w:r>
           </w:p>
@@ -4311,6 +3483,7 @@
           </w:p>
           <w:p>
             <w:r>
+              <w:lastRenderedPageBreak/>
               <w:t>You’re about two</w:t>
             </w:r>
             <w:r>
@@ -6796,7 +5969,11 @@
       </w:tr>
     </w:tbl>
     <w:p/>
-    <w:p/>
+    <w:p>
+      <w:r>
+        <w:t xml:space="preserve">This project told me a lot about design of secure API’s especially with the way that I designed the AI server as well as protecting us data and never trusting anything client side. </w:t>
+      </w:r>
+    </w:p>
     <w:sectPr>
       <w:pgSz w:w="11906" w:h="16838"/>
       <w:pgMar w:top="720" w:right="720" w:bottom="720" w:left="720" w:header="708" w:footer="708" w:gutter="0"/>

</xml_diff>